<commit_message>
fix: repara template recibo_venda.docx separando tags em linhas distintas
</commit_message>
<xml_diff>
--- a/backend/templates/recibo_venda.docx
+++ b/backend/templates/recibo_venda.docx
@@ -98,11 +98,6 @@
           <w:lang w:val="pt-BR"/>
         </w:rPr>
         <w:br/>
-      </w:r>
-      <w:r>
-        <w:rPr>
-          <w:lang w:val="pt-BR"/>
-        </w:rPr>
         <w:br/>
       </w:r>
       <w:r>
@@ -247,7 +242,28 @@
         <w:rPr>
           <w:lang w:val="pt-BR"/>
         </w:rPr>
-        <w:t>_________________________________________{{Nome do cliente}}{{CPF/CNPJ}}{{KM}}</w:t>
+        <w:t>_________________________________________</w:t>
+      </w:r>
+      <w:r>
+        <w:rPr>
+          <w:lang w:val="pt-BR"/>
+        </w:rPr>
+        <w:br/>
+        <w:t>{{Nome do cliente}}</w:t>
+      </w:r>
+      <w:r>
+        <w:rPr>
+          <w:lang w:val="pt-BR"/>
+        </w:rPr>
+        <w:br/>
+        <w:t>{{CPF/CNPJ}}</w:t>
+      </w:r>
+      <w:r>
+        <w:rPr>
+          <w:lang w:val="pt-BR"/>
+        </w:rPr>
+        <w:br/>
+        <w:t>{{KM}}</w:t>
       </w:r>
     </w:p>
     <w:sectPr>

</xml_diff>